<commit_message>
proposal updated with schematic
</commit_message>
<xml_diff>
--- a/Proposal/Self_Driving_RC_Proposal.docx
+++ b/Proposal/Self_Driving_RC_Proposal.docx
@@ -1492,6 +1492,57 @@
       <w:r>
         <w:rPr/>
         <w:t>Electricity and internet access</w:t>
+      </w:r>
+    </w:p>
+    <w:p>
+      <w:pPr>
+        <w:jc w:val="center"/>
+      </w:pPr>
+      <w:r>
+        <w:drawing>
+          <wp:inline>
+            <wp:extent cx="5943600" cy="3312891"/>
+            <wp:docPr id="1684228658" name="Picture 1684228658"/>
+            <wp:cNvGraphicFramePr>
+              <a:graphicFrameLocks noChangeAspect="1"/>
+            </wp:cNvGraphicFramePr>
+            <a:graphic>
+              <a:graphicData uri="http://schemas.openxmlformats.org/drawingml/2006/picture">
+                <pic:pic>
+                  <pic:nvPicPr>
+                    <pic:cNvPr id="0" name="Autonomous Car Schematic.png"/>
+                    <pic:cNvPicPr/>
+                  </pic:nvPicPr>
+                  <pic:blipFill>
+                    <a:blip r:embed="rId19"/>
+                    <a:stretch>
+                      <a:fillRect/>
+                    </a:stretch>
+                  </pic:blipFill>
+                  <pic:spPr>
+                    <a:xfrm>
+                      <a:off x="0" y="0"/>
+                      <a:ext cx="5943600" cy="3312891"/>
+                    </a:xfrm>
+                    <a:prstGeom prst="rect"/>
+                  </pic:spPr>
+                </pic:pic>
+              </a:graphicData>
+            </a:graphic>
+          </wp:inline>
+        </w:drawing>
+      </w:r>
+    </w:p>
+    <w:p>
+      <w:pPr>
+        <w:jc w:val="center"/>
+      </w:pPr>
+      <w:r>
+        <w:rPr>
+          <w:i/>
+          <w:sz w:val="20"/>
+        </w:rPr>
+        <w:t>Figure: System Schematic</w:t>
       </w:r>
     </w:p>
     <w:p/>

</xml_diff>